<commit_message>
docs: corregir nombre a Azuleica Betsabel de la Cruz González
Se reemplaza "Zuleica" por "Azuleica" en el texto de los .docx
(asignaciones, Documento Maestro, informes ejecutivos y plantilla de
portada), en los nombres de archivo y en docs/README.md. El cambio se
hace solo en el texto, sin alterar el formato.

Co-Authored-By: Claude Opus 5.5 <noreply@anthropic.com>
</commit_message>
<xml_diff>
--- a/docs/Asignacion_Tareas/Avance_2_50_Porciento/FORMATO_ASIGNACION_AVANCE2_JOAQUIN_ULISES_GARCIA.docx
+++ b/docs/Asignacion_Tareas/Avance_2_50_Porciento/FORMATO_ASIGNACION_AVANCE2_JOAQUIN_ULISES_GARCIA.docx
@@ -321,7 +321,7 @@
           <w:sz w:val="21"/>
           <w:rFonts w:ascii="Times New Roman" w:hAnsi="Times New Roman" w:cs="Times New Roman"/>
         </w:rPr>
-        <w:t xml:space="preserve">   - Mantener comunicación prioritaria con Santiago Cuevas Sánchez y Zuleica Betsabel de la Cruz González para recibir la lista de subredes de la Facultad.</w:t>
+        <w:t xml:space="preserve">   - Mantener comunicación prioritaria con Santiago Cuevas Sánchez y Azuleica Betsabel de la Cruz González para recibir la lista de subredes de la Facultad.</w:t>
       </w:r>
     </w:p>
     <w:p>
@@ -562,6 +562,10 @@
       </w:r>
     </w:p>
     <w:sectPr>
+      <w:headerReference w:type="default" r:id="rId6"/>
+      <w:footerReference w:type="default" r:id="rId7"/>
+      <w:headerReference w:type="first" r:id="rId8"/>
+      <w:footerReference w:type="first" r:id="rId9"/>
       <w:pgSz w:w="12240" w:h="15840"/>
       <w:pgMar w:top="1417" w:right="1701" w:bottom="1417" w:left="1701" w:header="708" w:footer="708" w:gutter="0"/>
       <w:cols w:space="708"/>
@@ -569,6 +573,46 @@
     </w:sectPr>
   </w:body>
 </w:document>
+</file>
+
+<file path=word/footer1.xml><?xml version="1.0" encoding="utf-8"?>
+<w:ftr xmlns:m="http://schemas.openxmlformats.org/officeDocument/2006/math" xmlns:mc="http://schemas.openxmlformats.org/markup-compatibility/2006" xmlns:mo="http://schemas.microsoft.com/office/mac/office/2008/main" xmlns:mv="urn:schemas-microsoft-com:mac:vml" xmlns:o="urn:schemas-microsoft-com:office:office" xmlns:r="http://schemas.openxmlformats.org/officeDocument/2006/relationships" xmlns:v="urn:schemas-microsoft-com:vml" xmlns:w10="urn:schemas-microsoft-com:office:word" xmlns:w14="http://schemas.microsoft.com/office/word/2010/wordml" xmlns:w="http://schemas.openxmlformats.org/wordprocessingml/2006/main" xmlns:wne="http://schemas.microsoft.com/office/word/2006/wordml" xmlns:wp14="http://schemas.microsoft.com/office/word/2010/wordprocessingDrawing" xmlns:wp="http://schemas.openxmlformats.org/drawingml/2006/wordprocessingDrawing" xmlns:wpc="http://schemas.microsoft.com/office/word/2010/wordprocessingCanvas" xmlns:wpg="http://schemas.microsoft.com/office/word/2010/wordprocessingGroup" xmlns:wpi="http://schemas.microsoft.com/office/word/2010/wordprocessingInk" xmlns:wps="http://schemas.microsoft.com/office/word/2010/wordprocessingShape" mc:Ignorable="w14 wp14">
+  <w:p>
+    <w:pPr>
+      <w:pStyle w:val="Footer"/>
+    </w:pPr>
+  </w:p>
+</w:ftr>
+</file>
+
+<file path=word/footer2.xml><?xml version="1.0" encoding="utf-8"?>
+<w:ftr xmlns:m="http://schemas.openxmlformats.org/officeDocument/2006/math" xmlns:mc="http://schemas.openxmlformats.org/markup-compatibility/2006" xmlns:mo="http://schemas.microsoft.com/office/mac/office/2008/main" xmlns:mv="urn:schemas-microsoft-com:mac:vml" xmlns:o="urn:schemas-microsoft-com:office:office" xmlns:r="http://schemas.openxmlformats.org/officeDocument/2006/relationships" xmlns:v="urn:schemas-microsoft-com:vml" xmlns:w10="urn:schemas-microsoft-com:office:word" xmlns:w14="http://schemas.microsoft.com/office/word/2010/wordml" xmlns:w="http://schemas.openxmlformats.org/wordprocessingml/2006/main" xmlns:wne="http://schemas.microsoft.com/office/word/2006/wordml" xmlns:wp14="http://schemas.microsoft.com/office/word/2010/wordprocessingDrawing" xmlns:wp="http://schemas.openxmlformats.org/drawingml/2006/wordprocessingDrawing" xmlns:wpc="http://schemas.microsoft.com/office/word/2010/wordprocessingCanvas" xmlns:wpg="http://schemas.microsoft.com/office/word/2010/wordprocessingGroup" xmlns:wpi="http://schemas.microsoft.com/office/word/2010/wordprocessingInk" xmlns:wps="http://schemas.microsoft.com/office/word/2010/wordprocessingShape" mc:Ignorable="w14 wp14">
+  <w:p>
+    <w:pPr>
+      <w:pStyle w:val="Footer"/>
+    </w:pPr>
+  </w:p>
+</w:ftr>
+</file>
+
+<file path=word/header1.xml><?xml version="1.0" encoding="utf-8"?>
+<w:hdr xmlns:m="http://schemas.openxmlformats.org/officeDocument/2006/math" xmlns:mc="http://schemas.openxmlformats.org/markup-compatibility/2006" xmlns:mo="http://schemas.microsoft.com/office/mac/office/2008/main" xmlns:mv="urn:schemas-microsoft-com:mac:vml" xmlns:o="urn:schemas-microsoft-com:office:office" xmlns:r="http://schemas.openxmlformats.org/officeDocument/2006/relationships" xmlns:v="urn:schemas-microsoft-com:vml" xmlns:w10="urn:schemas-microsoft-com:office:word" xmlns:w14="http://schemas.microsoft.com/office/word/2010/wordml" xmlns:w="http://schemas.openxmlformats.org/wordprocessingml/2006/main" xmlns:wne="http://schemas.microsoft.com/office/word/2006/wordml" xmlns:wp14="http://schemas.microsoft.com/office/word/2010/wordprocessingDrawing" xmlns:wp="http://schemas.openxmlformats.org/drawingml/2006/wordprocessingDrawing" xmlns:wpc="http://schemas.microsoft.com/office/word/2010/wordprocessingCanvas" xmlns:wpg="http://schemas.microsoft.com/office/word/2010/wordprocessingGroup" xmlns:wpi="http://schemas.microsoft.com/office/word/2010/wordprocessingInk" xmlns:wps="http://schemas.microsoft.com/office/word/2010/wordprocessingShape" mc:Ignorable="w14 wp14">
+  <w:p>
+    <w:pPr>
+      <w:pStyle w:val="Header"/>
+    </w:pPr>
+  </w:p>
+</w:hdr>
+</file>
+
+<file path=word/header2.xml><?xml version="1.0" encoding="utf-8"?>
+<w:hdr xmlns:m="http://schemas.openxmlformats.org/officeDocument/2006/math" xmlns:mc="http://schemas.openxmlformats.org/markup-compatibility/2006" xmlns:mo="http://schemas.microsoft.com/office/mac/office/2008/main" xmlns:mv="urn:schemas-microsoft-com:mac:vml" xmlns:o="urn:schemas-microsoft-com:office:office" xmlns:r="http://schemas.openxmlformats.org/officeDocument/2006/relationships" xmlns:v="urn:schemas-microsoft-com:vml" xmlns:w10="urn:schemas-microsoft-com:office:word" xmlns:w14="http://schemas.microsoft.com/office/word/2010/wordml" xmlns:w="http://schemas.openxmlformats.org/wordprocessingml/2006/main" xmlns:wne="http://schemas.microsoft.com/office/word/2006/wordml" xmlns:wp14="http://schemas.microsoft.com/office/word/2010/wordprocessingDrawing" xmlns:wp="http://schemas.openxmlformats.org/drawingml/2006/wordprocessingDrawing" xmlns:wpc="http://schemas.microsoft.com/office/word/2010/wordprocessingCanvas" xmlns:wpg="http://schemas.microsoft.com/office/word/2010/wordprocessingGroup" xmlns:wpi="http://schemas.microsoft.com/office/word/2010/wordprocessingInk" xmlns:wps="http://schemas.microsoft.com/office/word/2010/wordprocessingShape" mc:Ignorable="w14 wp14">
+  <w:p>
+    <w:pPr>
+      <w:pStyle w:val="Header"/>
+    </w:pPr>
+  </w:p>
+</w:hdr>
 </file>
 
 <file path=word/styles.xml><?xml version="1.0" encoding="utf-8"?>

</xml_diff>